<commit_message>
feat: add functionality to update return time for official business requests; enhance related UI components and API integration
</commit_message>
<xml_diff>
--- a/frontend/public/templates/officialBusiness.docx
+++ b/frontend/public/templates/officialBusiness.docx
@@ -25,10 +25,12 @@
         <w:gridCol w:w="1036"/>
         <w:gridCol w:w="2267"/>
         <w:gridCol w:w="992"/>
-        <w:gridCol w:w="2191"/>
-        <w:gridCol w:w="175"/>
-        <w:gridCol w:w="896"/>
-        <w:gridCol w:w="2366"/>
+        <w:gridCol w:w="525"/>
+        <w:gridCol w:w="1134"/>
+        <w:gridCol w:w="528"/>
+        <w:gridCol w:w="179"/>
+        <w:gridCol w:w="994"/>
+        <w:gridCol w:w="2268"/>
       </w:tblGrid>
       <w:tr>
         <w:trPr>
@@ -37,8 +39,8 @@
         </w:trPr>
         <w:tc>
           <w:tcPr>
-            <w:tcW w:w="6488" w:type="dxa"/>
-            <w:gridSpan w:val="4"/>
+            <w:tcW w:w="6482" w:type="dxa"/>
+            <w:gridSpan w:val="6"/>
             <w:tcBorders>
               <w:top w:val="single" w:sz="12" w:space="0" w:color="auto"/>
               <w:bottom w:val="single" w:sz="6" w:space="0" w:color="auto"/>
@@ -80,7 +82,7 @@
         </w:tc>
         <w:tc>
           <w:tcPr>
-            <w:tcW w:w="3435" w:type="dxa"/>
+            <w:tcW w:w="3441" w:type="dxa"/>
             <w:gridSpan w:val="3"/>
             <w:tcBorders>
               <w:top w:val="single" w:sz="12" w:space="0" w:color="auto"/>
@@ -189,7 +191,8 @@
         </w:tc>
         <w:tc>
           <w:tcPr>
-            <w:tcW w:w="2268" w:type="dxa"/>
+            <w:tcW w:w="3784" w:type="dxa"/>
+            <w:gridSpan w:val="3"/>
             <w:tcBorders>
               <w:top w:val="nil"/>
             </w:tcBorders>
@@ -197,6 +200,7 @@
           </w:tcPr>
           <w:p>
             <w:pPr>
+              <w:ind w:left="57" w:right="57"/>
               <w:jc w:val="center"/>
               <w:rPr>
                 <w:rFonts w:ascii="標楷體" w:eastAsia="標楷體" w:hAnsi="標楷體"/>
@@ -218,7 +222,7 @@
         </w:tc>
         <w:tc>
           <w:tcPr>
-            <w:tcW w:w="992" w:type="dxa"/>
+            <w:tcW w:w="1134" w:type="dxa"/>
             <w:tcBorders>
               <w:top w:val="nil"/>
             </w:tcBorders>
@@ -242,8 +246,8 @@
         </w:tc>
         <w:tc>
           <w:tcPr>
-            <w:tcW w:w="2367" w:type="dxa"/>
-            <w:gridSpan w:val="2"/>
+            <w:tcW w:w="3969" w:type="dxa"/>
+            <w:gridSpan w:val="4"/>
             <w:tcBorders>
               <w:top w:val="nil"/>
             </w:tcBorders>
@@ -256,6 +260,8 @@
                 <w:rFonts w:ascii="標楷體" w:eastAsia="標楷體" w:hAnsi="標楷體"/>
               </w:rPr>
             </w:pPr>
+            <w:bookmarkStart w:id="0" w:name="_GoBack"/>
+            <w:bookmarkEnd w:id="0"/>
             <w:r>
               <w:rPr>
                 <w:rFonts w:ascii="標楷體" w:eastAsia="標楷體" w:hAnsi="標楷體" w:hint="eastAsia"/>
@@ -273,86 +279,6 @@
                 <w:rFonts w:ascii="標楷體" w:eastAsia="標楷體" w:hAnsi="標楷體"/>
               </w:rPr>
               <w:t>icensePlate</w:t>
-            </w:r>
-            <w:r>
-              <w:rPr>
-                <w:rFonts w:ascii="標楷體" w:eastAsia="標楷體" w:hAnsi="標楷體"/>
-              </w:rPr>
-              <w:t>}</w:t>
-            </w:r>
-          </w:p>
-        </w:tc>
-        <w:tc>
-          <w:tcPr>
-            <w:tcW w:w="893" w:type="dxa"/>
-            <w:tcBorders>
-              <w:top w:val="nil"/>
-            </w:tcBorders>
-            <w:vAlign w:val="center"/>
-          </w:tcPr>
-          <w:p>
-            <w:pPr>
-              <w:ind w:left="57" w:right="57"/>
-              <w:jc w:val="distribute"/>
-              <w:rPr>
-                <w:rFonts w:ascii="標楷體" w:eastAsia="標楷體" w:hAnsi="標楷體"/>
-              </w:rPr>
-            </w:pPr>
-            <w:r>
-              <w:rPr>
-                <w:rFonts w:ascii="標楷體" w:eastAsia="標楷體" w:hAnsi="標楷體"/>
-              </w:rPr>
-              <w:t>外出</w:t>
-            </w:r>
-          </w:p>
-          <w:p>
-            <w:pPr>
-              <w:ind w:left="57" w:right="57"/>
-              <w:jc w:val="distribute"/>
-              <w:rPr>
-                <w:rFonts w:ascii="標楷體" w:eastAsia="標楷體" w:hAnsi="標楷體"/>
-              </w:rPr>
-            </w:pPr>
-            <w:r>
-              <w:rPr>
-                <w:rFonts w:ascii="標楷體" w:eastAsia="標楷體" w:hAnsi="標楷體"/>
-              </w:rPr>
-              <w:t>時間</w:t>
-            </w:r>
-          </w:p>
-        </w:tc>
-        <w:tc>
-          <w:tcPr>
-            <w:tcW w:w="2367" w:type="dxa"/>
-            <w:tcBorders>
-              <w:top w:val="nil"/>
-            </w:tcBorders>
-            <w:vAlign w:val="center"/>
-          </w:tcPr>
-          <w:p>
-            <w:pPr>
-              <w:jc w:val="center"/>
-              <w:rPr>
-                <w:rFonts w:ascii="標楷體" w:eastAsia="標楷體" w:hAnsi="標楷體"/>
-              </w:rPr>
-            </w:pPr>
-            <w:r>
-              <w:rPr>
-                <w:rFonts w:ascii="標楷體" w:eastAsia="標楷體" w:hAnsi="標楷體" w:hint="eastAsia"/>
-              </w:rPr>
-              <w:t>{</w:t>
-            </w:r>
-            <w:r>
-              <w:rPr>
-                <w:rFonts w:ascii="標楷體" w:eastAsia="標楷體" w:hAnsi="標楷體" w:hint="eastAsia"/>
-              </w:rPr>
-              <w:t>s</w:t>
-            </w:r>
-            <w:r>
-              <w:rPr>
-                <w:rFonts w:ascii="標楷體" w:eastAsia="標楷體" w:hAnsi="標楷體"/>
-              </w:rPr>
-              <w:t>tartTime</w:t>
             </w:r>
             <w:r>
               <w:rPr>
@@ -383,29 +309,70 @@
             </w:pPr>
             <w:r>
               <w:rPr>
-                <w:rFonts w:ascii="標楷體" w:eastAsia="標楷體" w:hAnsi="標楷體" w:hint="eastAsia"/>
-              </w:rPr>
-              <w:t>起表</w:t>
-            </w:r>
-          </w:p>
-        </w:tc>
-        <w:tc>
-          <w:tcPr>
-            <w:tcW w:w="2268" w:type="dxa"/>
-            <w:vAlign w:val="center"/>
-          </w:tcPr>
-          <w:p>
-            <w:pPr>
+                <w:rFonts w:ascii="標楷體" w:eastAsia="標楷體" w:hAnsi="標楷體"/>
+              </w:rPr>
+              <w:t>外出</w:t>
+            </w:r>
+          </w:p>
+          <w:p>
+            <w:pPr>
+              <w:ind w:left="57" w:right="57"/>
+              <w:jc w:val="distribute"/>
+              <w:rPr>
+                <w:rFonts w:ascii="標楷體" w:eastAsia="標楷體" w:hAnsi="標楷體"/>
+              </w:rPr>
+            </w:pPr>
+            <w:r>
+              <w:rPr>
+                <w:rFonts w:ascii="標楷體" w:eastAsia="標楷體" w:hAnsi="標楷體"/>
+              </w:rPr>
+              <w:t>時間</w:t>
+            </w:r>
+          </w:p>
+        </w:tc>
+        <w:tc>
+          <w:tcPr>
+            <w:tcW w:w="3784" w:type="dxa"/>
+            <w:gridSpan w:val="3"/>
+            <w:vAlign w:val="center"/>
+          </w:tcPr>
+          <w:p>
+            <w:pPr>
+              <w:ind w:left="57" w:right="57"/>
               <w:jc w:val="center"/>
               <w:rPr>
                 <w:rFonts w:ascii="標楷體" w:eastAsia="標楷體" w:hAnsi="標楷體"/>
               </w:rPr>
             </w:pPr>
-          </w:p>
-        </w:tc>
-        <w:tc>
-          <w:tcPr>
-            <w:tcW w:w="992" w:type="dxa"/>
+            <w:r>
+              <w:rPr>
+                <w:rFonts w:ascii="標楷體" w:eastAsia="標楷體" w:hAnsi="標楷體" w:hint="eastAsia"/>
+              </w:rPr>
+              <w:t>{</w:t>
+            </w:r>
+            <w:r>
+              <w:rPr>
+                <w:rFonts w:ascii="標楷體" w:eastAsia="標楷體" w:hAnsi="標楷體" w:hint="eastAsia"/>
+              </w:rPr>
+              <w:t>s</w:t>
+            </w:r>
+            <w:r>
+              <w:rPr>
+                <w:rFonts w:ascii="標楷體" w:eastAsia="標楷體" w:hAnsi="標楷體"/>
+              </w:rPr>
+              <w:t>tartTime</w:t>
+            </w:r>
+            <w:r>
+              <w:rPr>
+                <w:rFonts w:ascii="標楷體" w:eastAsia="標楷體" w:hAnsi="標楷體"/>
+              </w:rPr>
+              <w:t>}</w:t>
+            </w:r>
+          </w:p>
+        </w:tc>
+        <w:tc>
+          <w:tcPr>
+            <w:tcW w:w="1134" w:type="dxa"/>
             <w:tcBorders>
               <w:bottom w:val="nil"/>
             </w:tcBorders>
@@ -421,61 +388,17 @@
             </w:pPr>
             <w:r>
               <w:rPr>
-                <w:rFonts w:ascii="標楷體" w:eastAsia="標楷體" w:hAnsi="標楷體" w:hint="eastAsia"/>
-              </w:rPr>
-              <w:t>止表</w:t>
-            </w:r>
-          </w:p>
-        </w:tc>
-        <w:tc>
-          <w:tcPr>
-            <w:tcW w:w="2367" w:type="dxa"/>
-            <w:gridSpan w:val="2"/>
-            <w:tcBorders>
-              <w:bottom w:val="nil"/>
-            </w:tcBorders>
-            <w:vAlign w:val="center"/>
-          </w:tcPr>
-          <w:p>
-            <w:pPr>
-              <w:jc w:val="center"/>
-              <w:rPr>
-                <w:rFonts w:ascii="標楷體" w:eastAsia="標楷體" w:hAnsi="標楷體"/>
-              </w:rPr>
-            </w:pPr>
-            <w:bookmarkStart w:id="0" w:name="_GoBack"/>
-            <w:bookmarkEnd w:id="0"/>
-          </w:p>
-        </w:tc>
-        <w:tc>
-          <w:tcPr>
-            <w:tcW w:w="896" w:type="dxa"/>
-            <w:tcBorders>
-              <w:bottom w:val="nil"/>
-            </w:tcBorders>
-            <w:vAlign w:val="center"/>
-          </w:tcPr>
+                <w:rFonts w:ascii="標楷體" w:eastAsia="標楷體" w:hAnsi="標楷體"/>
+              </w:rPr>
+              <w:t>返回</w:t>
+            </w:r>
+          </w:p>
           <w:p>
             <w:pPr>
               <w:ind w:left="57" w:right="57"/>
               <w:jc w:val="distribute"/>
               <w:rPr>
-                <w:rFonts w:ascii="標楷體" w:eastAsia="標楷體" w:hAnsi="標楷體" w:hint="eastAsia"/>
-              </w:rPr>
-            </w:pPr>
-            <w:r>
-              <w:rPr>
-                <w:rFonts w:ascii="標楷體" w:eastAsia="標楷體" w:hAnsi="標楷體"/>
-              </w:rPr>
-              <w:t>返回</w:t>
-            </w:r>
-          </w:p>
-          <w:p>
-            <w:pPr>
-              <w:ind w:left="57" w:right="57"/>
-              <w:jc w:val="distribute"/>
-              <w:rPr>
-                <w:rFonts w:ascii="標楷體" w:eastAsia="標楷體" w:hAnsi="標楷體" w:hint="eastAsia"/>
+                <w:rFonts w:ascii="標楷體" w:eastAsia="標楷體" w:hAnsi="標楷體"/>
               </w:rPr>
             </w:pPr>
             <w:r>
@@ -488,7 +411,8 @@
         </w:tc>
         <w:tc>
           <w:tcPr>
-            <w:tcW w:w="2364" w:type="dxa"/>
+            <w:tcW w:w="3969" w:type="dxa"/>
+            <w:gridSpan w:val="4"/>
             <w:tcBorders>
               <w:bottom w:val="nil"/>
             </w:tcBorders>
@@ -545,7 +469,7 @@
         <w:tc>
           <w:tcPr>
             <w:tcW w:w="8887" w:type="dxa"/>
-            <w:gridSpan w:val="6"/>
+            <w:gridSpan w:val="8"/>
             <w:vAlign w:val="center"/>
           </w:tcPr>
           <w:p>
@@ -610,7 +534,7 @@
         </w:tc>
         <w:tc>
           <w:tcPr>
-            <w:tcW w:w="2268" w:type="dxa"/>
+            <w:tcW w:w="2267" w:type="dxa"/>
             <w:vAlign w:val="center"/>
           </w:tcPr>
           <w:p>
@@ -645,21 +569,21 @@
         </w:tc>
         <w:tc>
           <w:tcPr>
-            <w:tcW w:w="2367" w:type="dxa"/>
-            <w:gridSpan w:val="2"/>
-            <w:vAlign w:val="center"/>
-          </w:tcPr>
-          <w:p>
-            <w:pPr>
-              <w:rPr>
-                <w:rFonts w:ascii="標楷體" w:eastAsia="標楷體" w:hAnsi="標楷體"/>
-              </w:rPr>
-            </w:pPr>
-          </w:p>
-        </w:tc>
-        <w:tc>
-          <w:tcPr>
-            <w:tcW w:w="893" w:type="dxa"/>
+            <w:tcW w:w="2366" w:type="dxa"/>
+            <w:gridSpan w:val="4"/>
+            <w:vAlign w:val="center"/>
+          </w:tcPr>
+          <w:p>
+            <w:pPr>
+              <w:rPr>
+                <w:rFonts w:ascii="標楷體" w:eastAsia="標楷體" w:hAnsi="標楷體"/>
+              </w:rPr>
+            </w:pPr>
+          </w:p>
+        </w:tc>
+        <w:tc>
+          <w:tcPr>
+            <w:tcW w:w="994" w:type="dxa"/>
             <w:vAlign w:val="center"/>
           </w:tcPr>
           <w:p>
@@ -673,13 +597,13 @@
               <w:rPr>
                 <w:rFonts w:ascii="標楷體" w:eastAsia="標楷體" w:hAnsi="標楷體" w:hint="eastAsia"/>
               </w:rPr>
-              <w:t>管理部</w:t>
-            </w:r>
-          </w:p>
-        </w:tc>
-        <w:tc>
-          <w:tcPr>
-            <w:tcW w:w="2367" w:type="dxa"/>
+              <w:t>人事</w:t>
+            </w:r>
+          </w:p>
+        </w:tc>
+        <w:tc>
+          <w:tcPr>
+            <w:tcW w:w="2268" w:type="dxa"/>
             <w:vAlign w:val="center"/>
           </w:tcPr>
           <w:p>
@@ -1164,7 +1088,7 @@
   <w:style w:type="paragraph" w:default="1" w:styleId="a">
     <w:name w:val="Normal"/>
     <w:qFormat/>
-    <w:rsid w:val="00AA12ED"/>
+    <w:rsid w:val="00EA7E07"/>
     <w:pPr>
       <w:widowControl w:val="0"/>
     </w:pPr>

</xml_diff>

<commit_message>
feat: enhance Employee model and services to include jobTitleCode2 and jobTitleDescription; update attendance filtering logic and official business document generation
</commit_message>
<xml_diff>
--- a/frontend/public/templates/officialBusiness.docx
+++ b/frontend/public/templates/officialBusiness.docx
@@ -22,15 +22,15 @@
         <w:tblLook w:val="0000" w:firstRow="0" w:lastRow="0" w:firstColumn="0" w:lastColumn="0" w:noHBand="0" w:noVBand="0"/>
       </w:tblPr>
       <w:tblGrid>
-        <w:gridCol w:w="1036"/>
-        <w:gridCol w:w="2267"/>
+        <w:gridCol w:w="993"/>
+        <w:gridCol w:w="1984"/>
         <w:gridCol w:w="992"/>
-        <w:gridCol w:w="525"/>
-        <w:gridCol w:w="1134"/>
-        <w:gridCol w:w="528"/>
-        <w:gridCol w:w="179"/>
-        <w:gridCol w:w="994"/>
-        <w:gridCol w:w="2268"/>
+        <w:gridCol w:w="993"/>
+        <w:gridCol w:w="992"/>
+        <w:gridCol w:w="283"/>
+        <w:gridCol w:w="245"/>
+        <w:gridCol w:w="748"/>
+        <w:gridCol w:w="2693"/>
       </w:tblGrid>
       <w:tr>
         <w:trPr>
@@ -40,7 +40,7 @@
         <w:tc>
           <w:tcPr>
             <w:tcW w:w="6482" w:type="dxa"/>
-            <w:gridSpan w:val="6"/>
+            <w:gridSpan w:val="7"/>
             <w:tcBorders>
               <w:top w:val="single" w:sz="12" w:space="0" w:color="auto"/>
               <w:bottom w:val="single" w:sz="6" w:space="0" w:color="auto"/>
@@ -83,7 +83,7 @@
         <w:tc>
           <w:tcPr>
             <w:tcW w:w="3441" w:type="dxa"/>
-            <w:gridSpan w:val="3"/>
+            <w:gridSpan w:val="2"/>
             <w:tcBorders>
               <w:top w:val="single" w:sz="12" w:space="0" w:color="auto"/>
               <w:left w:val="nil"/>
@@ -167,7 +167,7 @@
         </w:trPr>
         <w:tc>
           <w:tcPr>
-            <w:tcW w:w="1036" w:type="dxa"/>
+            <w:tcW w:w="993" w:type="dxa"/>
             <w:tcBorders>
               <w:top w:val="nil"/>
             </w:tcBorders>
@@ -185,13 +185,67 @@
               <w:rPr>
                 <w:rFonts w:ascii="標楷體" w:eastAsia="標楷體" w:hAnsi="標楷體" w:hint="eastAsia"/>
               </w:rPr>
-              <w:t>姓名</w:t>
-            </w:r>
-          </w:p>
-        </w:tc>
-        <w:tc>
-          <w:tcPr>
-            <w:tcW w:w="3784" w:type="dxa"/>
+              <w:t>申請人</w:t>
+            </w:r>
+          </w:p>
+        </w:tc>
+        <w:tc>
+          <w:tcPr>
+            <w:tcW w:w="1984" w:type="dxa"/>
+            <w:tcBorders>
+              <w:top w:val="nil"/>
+            </w:tcBorders>
+            <w:vAlign w:val="center"/>
+          </w:tcPr>
+          <w:p>
+            <w:pPr>
+              <w:ind w:left="57" w:right="57"/>
+              <w:jc w:val="center"/>
+              <w:rPr>
+                <w:rFonts w:ascii="標楷體" w:eastAsia="標楷體" w:hAnsi="標楷體"/>
+              </w:rPr>
+            </w:pPr>
+            <w:r>
+              <w:rPr>
+                <w:rFonts w:ascii="標楷體" w:eastAsia="標楷體" w:hAnsi="標楷體" w:hint="eastAsia"/>
+              </w:rPr>
+              <w:t>{</w:t>
+            </w:r>
+            <w:r>
+              <w:rPr>
+                <w:rFonts w:ascii="標楷體" w:eastAsia="標楷體" w:hAnsi="標楷體"/>
+              </w:rPr>
+              <w:t>name}</w:t>
+            </w:r>
+          </w:p>
+        </w:tc>
+        <w:tc>
+          <w:tcPr>
+            <w:tcW w:w="992" w:type="dxa"/>
+            <w:tcBorders>
+              <w:top w:val="nil"/>
+            </w:tcBorders>
+            <w:vAlign w:val="center"/>
+          </w:tcPr>
+          <w:p>
+            <w:pPr>
+              <w:ind w:left="57" w:right="57"/>
+              <w:jc w:val="distribute"/>
+              <w:rPr>
+                <w:rFonts w:ascii="標楷體" w:eastAsia="標楷體" w:hAnsi="標楷體"/>
+              </w:rPr>
+            </w:pPr>
+            <w:r>
+              <w:rPr>
+                <w:rFonts w:ascii="標楷體" w:eastAsia="標楷體" w:hAnsi="標楷體" w:hint="eastAsia"/>
+              </w:rPr>
+              <w:t>參與人</w:t>
+            </w:r>
+          </w:p>
+        </w:tc>
+        <w:tc>
+          <w:tcPr>
+            <w:tcW w:w="2268" w:type="dxa"/>
             <w:gridSpan w:val="3"/>
             <w:tcBorders>
               <w:top w:val="nil"/>
@@ -206,23 +260,32 @@
                 <w:rFonts w:ascii="標楷體" w:eastAsia="標楷體" w:hAnsi="標楷體"/>
               </w:rPr>
             </w:pPr>
-            <w:r>
-              <w:rPr>
-                <w:rFonts w:ascii="標楷體" w:eastAsia="標楷體" w:hAnsi="標楷體" w:hint="eastAsia"/>
+            <w:bookmarkStart w:id="0" w:name="_GoBack"/>
+            <w:bookmarkEnd w:id="0"/>
+            <w:r>
+              <w:rPr>
+                <w:rFonts w:ascii="標楷體" w:eastAsia="標楷體" w:hAnsi="標楷體"/>
               </w:rPr>
               <w:t>{</w:t>
             </w:r>
             <w:r>
               <w:rPr>
-                <w:rFonts w:ascii="標楷體" w:eastAsia="標楷體" w:hAnsi="標楷體"/>
-              </w:rPr>
-              <w:t>name}</w:t>
-            </w:r>
-          </w:p>
-        </w:tc>
-        <w:tc>
-          <w:tcPr>
-            <w:tcW w:w="1134" w:type="dxa"/>
+                <w:rFonts w:ascii="標楷體" w:eastAsia="標楷體" w:hAnsi="標楷體" w:hint="eastAsia"/>
+              </w:rPr>
+              <w:t>m</w:t>
+            </w:r>
+            <w:r>
+              <w:rPr>
+                <w:rFonts w:ascii="標楷體" w:eastAsia="標楷體" w:hAnsi="標楷體"/>
+              </w:rPr>
+              <w:t>embers}</w:t>
+            </w:r>
+          </w:p>
+        </w:tc>
+        <w:tc>
+          <w:tcPr>
+            <w:tcW w:w="993" w:type="dxa"/>
+            <w:gridSpan w:val="2"/>
             <w:tcBorders>
               <w:top w:val="nil"/>
             </w:tcBorders>
@@ -230,7 +293,6 @@
           </w:tcPr>
           <w:p>
             <w:pPr>
-              <w:ind w:left="57" w:right="57"/>
               <w:jc w:val="distribute"/>
               <w:rPr>
                 <w:rFonts w:ascii="標楷體" w:eastAsia="標楷體" w:hAnsi="標楷體"/>
@@ -246,8 +308,7 @@
         </w:tc>
         <w:tc>
           <w:tcPr>
-            <w:tcW w:w="3969" w:type="dxa"/>
-            <w:gridSpan w:val="4"/>
+            <w:tcW w:w="2693" w:type="dxa"/>
             <w:tcBorders>
               <w:top w:val="nil"/>
             </w:tcBorders>
@@ -260,8 +321,6 @@
                 <w:rFonts w:ascii="標楷體" w:eastAsia="標楷體" w:hAnsi="標楷體"/>
               </w:rPr>
             </w:pPr>
-            <w:bookmarkStart w:id="0" w:name="_GoBack"/>
-            <w:bookmarkEnd w:id="0"/>
             <w:r>
               <w:rPr>
                 <w:rFonts w:ascii="標楷體" w:eastAsia="標楷體" w:hAnsi="標楷體" w:hint="eastAsia"/>
@@ -296,7 +355,7 @@
         </w:trPr>
         <w:tc>
           <w:tcPr>
-            <w:tcW w:w="1036" w:type="dxa"/>
+            <w:tcW w:w="993" w:type="dxa"/>
             <w:vAlign w:val="center"/>
           </w:tcPr>
           <w:p>
@@ -332,7 +391,7 @@
         </w:tc>
         <w:tc>
           <w:tcPr>
-            <w:tcW w:w="3784" w:type="dxa"/>
+            <w:tcW w:w="3969" w:type="dxa"/>
             <w:gridSpan w:val="3"/>
             <w:vAlign w:val="center"/>
           </w:tcPr>
@@ -372,7 +431,7 @@
         </w:tc>
         <w:tc>
           <w:tcPr>
-            <w:tcW w:w="1134" w:type="dxa"/>
+            <w:tcW w:w="992" w:type="dxa"/>
             <w:tcBorders>
               <w:bottom w:val="nil"/>
             </w:tcBorders>
@@ -447,7 +506,7 @@
         </w:trPr>
         <w:tc>
           <w:tcPr>
-            <w:tcW w:w="1036" w:type="dxa"/>
+            <w:tcW w:w="993" w:type="dxa"/>
             <w:vAlign w:val="center"/>
           </w:tcPr>
           <w:p>
@@ -468,7 +527,7 @@
         </w:tc>
         <w:tc>
           <w:tcPr>
-            <w:tcW w:w="8887" w:type="dxa"/>
+            <w:tcW w:w="8930" w:type="dxa"/>
             <w:gridSpan w:val="8"/>
             <w:vAlign w:val="center"/>
           </w:tcPr>
@@ -513,7 +572,7 @@
         </w:trPr>
         <w:tc>
           <w:tcPr>
-            <w:tcW w:w="1036" w:type="dxa"/>
+            <w:tcW w:w="993" w:type="dxa"/>
             <w:vAlign w:val="center"/>
           </w:tcPr>
           <w:p>
@@ -528,18 +587,18 @@
               <w:rPr>
                 <w:rFonts w:ascii="標楷體" w:eastAsia="標楷體" w:hAnsi="標楷體" w:hint="eastAsia"/>
               </w:rPr>
-              <w:t>簽名</w:t>
-            </w:r>
-          </w:p>
-        </w:tc>
-        <w:tc>
-          <w:tcPr>
-            <w:tcW w:w="2267" w:type="dxa"/>
-            <w:vAlign w:val="center"/>
-          </w:tcPr>
-          <w:p>
-            <w:pPr>
-              <w:jc w:val="center"/>
+              <w:t>主管</w:t>
+            </w:r>
+          </w:p>
+        </w:tc>
+        <w:tc>
+          <w:tcPr>
+            <w:tcW w:w="3969" w:type="dxa"/>
+            <w:gridSpan w:val="3"/>
+            <w:vAlign w:val="center"/>
+          </w:tcPr>
+          <w:p>
+            <w:pPr>
               <w:rPr>
                 <w:rFonts w:ascii="標楷體" w:eastAsia="標楷體" w:hAnsi="標楷體"/>
               </w:rPr>
@@ -553,7 +612,6 @@
           </w:tcPr>
           <w:p>
             <w:pPr>
-              <w:ind w:left="57" w:right="57"/>
               <w:jc w:val="distribute"/>
               <w:rPr>
                 <w:rFonts w:ascii="標楷體" w:eastAsia="標楷體" w:hAnsi="標楷體"/>
@@ -563,47 +621,14 @@
               <w:rPr>
                 <w:rFonts w:ascii="標楷體" w:eastAsia="標楷體" w:hAnsi="標楷體" w:hint="eastAsia"/>
               </w:rPr>
-              <w:t>主管</w:t>
-            </w:r>
-          </w:p>
-        </w:tc>
-        <w:tc>
-          <w:tcPr>
-            <w:tcW w:w="2366" w:type="dxa"/>
+              <w:t>人事</w:t>
+            </w:r>
+          </w:p>
+        </w:tc>
+        <w:tc>
+          <w:tcPr>
+            <w:tcW w:w="3969" w:type="dxa"/>
             <w:gridSpan w:val="4"/>
-            <w:vAlign w:val="center"/>
-          </w:tcPr>
-          <w:p>
-            <w:pPr>
-              <w:rPr>
-                <w:rFonts w:ascii="標楷體" w:eastAsia="標楷體" w:hAnsi="標楷體"/>
-              </w:rPr>
-            </w:pPr>
-          </w:p>
-        </w:tc>
-        <w:tc>
-          <w:tcPr>
-            <w:tcW w:w="994" w:type="dxa"/>
-            <w:vAlign w:val="center"/>
-          </w:tcPr>
-          <w:p>
-            <w:pPr>
-              <w:jc w:val="distribute"/>
-              <w:rPr>
-                <w:rFonts w:ascii="標楷體" w:eastAsia="標楷體" w:hAnsi="標楷體"/>
-              </w:rPr>
-            </w:pPr>
-            <w:r>
-              <w:rPr>
-                <w:rFonts w:ascii="標楷體" w:eastAsia="標楷體" w:hAnsi="標楷體" w:hint="eastAsia"/>
-              </w:rPr>
-              <w:t>人事</w:t>
-            </w:r>
-          </w:p>
-        </w:tc>
-        <w:tc>
-          <w:tcPr>
-            <w:tcW w:w="2268" w:type="dxa"/>
             <w:vAlign w:val="center"/>
           </w:tcPr>
           <w:p>

</xml_diff>